<commit_message>
Revisione Pattern: Builder, correzione dettagli documentazione
</commit_message>
<xml_diff>
--- a/designPattern/builder/builder.docx
+++ b/designPattern/builder/builder.docx
@@ -115,15 +115,7 @@
     </w:p>
     <w:p>
       <w:r>
-        <w:t xml:space="preserve">Ho implementato questo pattern con l’idea di dover creare ogni volta un menù per un ristorante in </w:t>
-      </w:r>
-      <w:proofErr w:type="gramStart"/>
-      <w:r>
-        <w:t>2</w:t>
-      </w:r>
-      <w:proofErr w:type="gramEnd"/>
-      <w:r>
-        <w:t xml:space="preserve"> modi differenti, abbiamo uno</w:t>
+        <w:t>Ho implementato questo pattern con l’idea di dover creare ogni volta un menù per un ristorante in 2 modi differenti, abbiamo uno</w:t>
       </w:r>
       <w:r>
         <w:rPr>
@@ -153,6 +145,9 @@
     </w:p>
     <w:p>
       <w:r>
+        <w:rPr>
+          <w:noProof/>
+        </w:rPr>
         <w:drawing>
           <wp:inline distT="0" distB="0" distL="0" distR="0" wp14:anchorId="3ABF08E9" wp14:editId="02A58CCC">
             <wp:extent cx="6120130" cy="2450465"/>
@@ -229,6 +224,9 @@
     </w:p>
     <w:p>
       <w:r>
+        <w:rPr>
+          <w:noProof/>
+        </w:rPr>
         <w:drawing>
           <wp:inline distT="0" distB="0" distL="0" distR="0" wp14:anchorId="54E586D0" wp14:editId="2BFF2460">
             <wp:extent cx="4958443" cy="2121152"/>
@@ -273,6 +271,9 @@
     </w:p>
     <w:p>
       <w:r>
+        <w:rPr>
+          <w:noProof/>
+        </w:rPr>
         <w:drawing>
           <wp:inline distT="0" distB="0" distL="0" distR="0" wp14:anchorId="1A181668" wp14:editId="0831CB4C">
             <wp:extent cx="5252357" cy="3287219"/>
@@ -371,6 +372,7 @@
       </w:pPr>
       <w:r>
         <w:rPr>
+          <w:noProof/>
           <w:u w:val="single"/>
         </w:rPr>
         <w:drawing>
@@ -418,6 +420,9 @@
         </w:rPr>
       </w:pPr>
       <w:r>
+        <w:rPr>
+          <w:noProof/>
+        </w:rPr>
         <w:drawing>
           <wp:anchor distT="0" distB="0" distL="114300" distR="114300" simplePos="0" relativeHeight="251658240" behindDoc="0" locked="0" layoutInCell="1" allowOverlap="1" wp14:anchorId="75B9328D" wp14:editId="06C94D6C">
             <wp:simplePos x="0" y="0"/>
@@ -487,11 +492,9 @@
       <w:r>
         <w:t xml:space="preserve">come builder otterrò il menu costruito nel modo </w:t>
       </w:r>
-      <w:proofErr w:type="gramStart"/>
-      <w:r>
-        <w:t>sopra, invece</w:t>
-      </w:r>
-      <w:proofErr w:type="gramEnd"/>
+      <w:r>
+        <w:t>sopra; invece,</w:t>
+      </w:r>
       <w:r>
         <w:t xml:space="preserve"> implementando altri builder otterrò menù diversi </w:t>
       </w:r>
@@ -528,15 +531,13 @@
         </w:rPr>
         <w:t xml:space="preserve">“Chef </w:t>
       </w:r>
-      <w:proofErr w:type="spellStart"/>
       <w:r>
         <w:rPr>
           <w:i/>
           <w:iCs/>
         </w:rPr>
-        <w:t>Cocnreto</w:t>
-      </w:r>
-      <w:proofErr w:type="spellEnd"/>
+        <w:t>Concreto</w:t>
+      </w:r>
       <w:r>
         <w:rPr>
           <w:i/>
@@ -560,6 +561,9 @@
     </w:p>
     <w:p>
       <w:r>
+        <w:rPr>
+          <w:noProof/>
+        </w:rPr>
         <w:drawing>
           <wp:inline distT="0" distB="0" distL="0" distR="0" wp14:anchorId="24680823" wp14:editId="6983B40C">
             <wp:extent cx="6120130" cy="2689225"/>

</xml_diff>